<commit_message>
V3R mirror 2026-03-19 11:05 UTC
</commit_message>
<xml_diff>
--- a/code/current/Dockerfile-ml-offline.docx
+++ b/code/current/Dockerfile-ml-offline.docx
@@ -831,7 +831,7 @@
         <w:rPr>
           <w:rtl w:val="0"/>
         </w:rPr>
-        <w:t xml:space="preserve"># Copy handlers</w:t>
+        <w:t xml:space="preserve"># Copy handlers (alphabetical)</w:t>
       </w:r>
     </w:p>
     <w:p>
@@ -936,6 +936,32 @@
           <w:rtl w:val="0"/>
         </w:rPr>
         <w:t xml:space="preserve">COPY lambda_ingest_v4.py ${LAMBDA_TASK_ROOT}</w:t>
+      </w:r>
+    </w:p>
+    <w:p>
+      <w:pPr>
+        <w:keepNext w:val="0"/>
+        <w:keepLines w:val="0"/>
+        <w:pageBreakBefore w:val="0"/>
+        <w:widowControl w:val="0"/>
+        <w:pBdr>
+          <w:top w:space="0" w:sz="0" w:val="nil"/>
+          <w:left w:space="0" w:sz="0" w:val="nil"/>
+          <w:bottom w:space="0" w:sz="0" w:val="nil"/>
+          <w:right w:space="0" w:sz="0" w:val="nil"/>
+          <w:between w:space="0" w:sz="0" w:val="nil"/>
+        </w:pBdr>
+        <w:shd w:fill="auto" w:val="clear"/>
+        <w:spacing w:after="0" w:before="0" w:line="276" w:lineRule="auto"/>
+        <w:ind w:left="0" w:right="0" w:firstLine="0"/>
+        <w:jc w:val="left"/>
+        <w:rPr/>
+      </w:pPr>
+      <w:r>
+        <w:rPr>
+          <w:rtl w:val="0"/>
+        </w:rPr>
+        <w:t xml:space="preserve">COPY lambda_key_reset.py ${LAMBDA_TASK_ROOT}</w:t>
       </w:r>
     </w:p>
     <w:p>

</xml_diff>